<commit_message>
Expand longitudinal manuscript draft
</commit_message>
<xml_diff>
--- a/submission_ready/longitudinal_tb_dynamics_20260318/02_Manuscript.docx
+++ b/submission_ready/longitudinal_tb_dynamics_20260318/02_Manuscript.docx
@@ -101,6 +101,16 @@
     </w:p>
     <w:p>
       <w:r>
+        <w:t>A longitudinal framework is also useful for a practical reason. If serial blood testing is ever to contribute to tuberculosis prevention or early recognition, the biomarker cannot be judged only by cross-sectional separation. It must also show interpretable behavior across repeated visits, because real implementation would almost certainly involve follow-up measurements rather than one isolated sample.</w:t>
+      </w:r>
+    </w:p>
+    <w:p>
+      <w:r>
+        <w:t>At the same time, longitudinal public-data analysis is technically demanding. Repeated collections create within-subject dependence, intermediate or unscheduled samples complicate the visit structure, and RNA-sequencing data released at exon or junction level require additional preprocessing before biologically meaningful gene-level interpretation becomes possible. These challenges make conservative remapping and model specification essential.</w:t>
+      </w:r>
+    </w:p>
+    <w:p>
+      <w:r>
         <w:t>The present analysis therefore takes a prespecified program-based approach. Instead of deriving a new single-cohort classifier, it evaluates whether host-response programs already highlighted by earlier harmonized public-data analyses show different temporal behavior in a remapped prospective RNA-sequencing cohort. This approach was chosen to reduce overfitting and to ask a more mechanistic question.</w:t>
       </w:r>
     </w:p>
@@ -129,6 +139,11 @@
       </w:r>
       <w:r>
         <w:t xml:space="preserve"> The locally remapped gene-level matrix linked each sample to a subject identifier, progressor status, and a parsed follow-up label. Scheduled visits included DAY0, DAY180, DAY360, and DAY540, while an additional OTHER group represented intermediate early collections. IC samples were retained but not forced onto the same numeric follow-up scale.</w:t>
+      </w:r>
+    </w:p>
+    <w:p>
+      <w:r>
+        <w:t>Gene-level remapping aggregated junction-level counts to gene symbols and then linked the resulting matrix to subject and visit information already curated in the local processed metadata. This step was necessary because direct use of junction identifiers would have prevented biologically interpretable program scoring and would have made comparison with prior gene-symbol analyses unnecessarily unstable.</w:t>
       </w:r>
     </w:p>
     <w:p>
@@ -169,7 +184,17 @@
     </w:p>
     <w:p>
       <w:r>
+        <w:t>This design was chosen deliberately. A positive progressor coefficient could reflect higher early values in progressors, whereas a negative interaction could reflect a steeper later decline; the two effects therefore answer different biological questions. By fitting them together, the analysis could distinguish initial separation from divergence in temporal behavior rather than conflating both into one summary score.</w:t>
+      </w:r>
+    </w:p>
+    <w:p>
+      <w:r>
         <w:t>IC samples were not included in the primary month-scale models because they are not naturally ordered alongside the scheduled visit structure in the remapped metadata. Instead, we compared IC samples with scheduled progressor samples in a sensitivity analysis. Multiple-testing correction used the Benjamini-Hochberg method within the program-level and gene-level model families.</w:t>
+      </w:r>
+    </w:p>
+    <w:p>
+      <w:r>
+        <w:t>The primary interpretation was prespecified before manuscript drafting. Program-level findings were considered stronger than gene-level findings if they remained directionally coherent, survived false-discovery control, and aligned with the descriptive time-course plots. This rule was intended to avoid overstating isolated nominal p values from individual transcripts.</w:t>
       </w:r>
     </w:p>
     <w:p>
@@ -197,12 +222,22 @@
     </w:p>
     <w:p>
       <w:r>
+        <w:t>The cell-state proxy layer added a complementary view. Neutrophil and platelet-associated proxies both showed progressor-by-month interactions that remained within the program-level false-discovery-supported set, while monocyte-associated scores were directionally compatible with the broader myeloid signal but did not show the same level of longitudinal interaction strength. This pattern suggests that the observed temporal behavior is not reducible to one simple composition shift.</w:t>
+      </w:r>
+    </w:p>
+    <w:p>
+      <w:r>
         <w:t>Gene-level models were less decisive. No individual gene trajectory survived multiple-testing correction, although ACSL1, FCGR3B, VSIG4 showed the strongest nominal progressor-by-month trends (Table 3; Fig. 4). This pattern argues that the longitudinal signal is more stable at the level of coordinated programs than at the level of isolated genes.</w:t>
       </w:r>
     </w:p>
     <w:p>
       <w:r>
         <w:t>The existing 25-gene signature proxy and the compact Bayesian core both trended in the same overall direction, but neither reached the same level of statistical support as the higher-order program scores. This further suggests that repeated follow-up captures shifting composite biology better than it captures one persistent dominant transcript.</w:t>
+      </w:r>
+    </w:p>
+    <w:p>
+      <w:r>
+        <w:t>The subject-level trajectory plot reinforces that interpretation. Individual trajectories were heterogeneous, which is expected in prospective host-response data, yet the overlaid mean curves still separated enough to support model-based program differences. In other words, the longitudinal signal was not driven by one or two extreme subjects but emerged from directional structure across the cohort.</w:t>
       </w:r>
     </w:p>
     <w:p>
@@ -226,6 +261,11 @@
     <w:p>
       <w:r>
         <w:t>The strongest supported programs were not random. The remap-sensitive myeloid set and the vascular proxy both showed steeper temporal shifts in progressors, and the M6 coexpression proxy moved in the same broad direction. Together, these findings are compatible with a model in which progression risk is associated with evolving myeloid activity and tissue-interface remodeling rather than with one static baseline inflammatory state.</w:t>
+      </w:r>
+    </w:p>
+    <w:p>
+      <w:r>
+        <w:t>This is also the point at which the longitudinal paper adds something genuinely different to the cross-sectional literature. Many prior transcriptomic studies already established that a blood signature can perform above chance at one time point. The present analysis suggests that when repeated sampling is available, the more stable biological story may reside in the way related programs move together across follow-up rather than in whether one gene remains consistently highest at every visit.</w:t>
       </w:r>
     </w:p>
     <w:p>
@@ -265,12 +305,22 @@
     </w:p>
     <w:p>
       <w:r>
+        <w:t>From a study-design perspective, the results also argue for a more disciplined way of using public longitudinal data. Remapping, subject linkage, and explicit handling of unscheduled collections are not merely technical preliminaries; they change what can be claimed biologically. The present workflow therefore offers a practical template for future reanalyses of TB transcriptomic cohorts with mixed visit structures.</w:t>
+      </w:r>
+    </w:p>
+    <w:p>
+      <w:r>
         <w:t>This distinction matters for translation. A clinically useful serial biomarker may ultimately need to summarize multidimensional host-response programs rather than rely on a single repeatedly measured transcript. Longitudinal program behavior could therefore become a complementary criterion for selecting robust candidate panels, alongside cross-sectional discrimination and cross-platform stability.</w:t>
       </w:r>
     </w:p>
     <w:p>
       <w:r>
         <w:t>Several limitations remain. The primary longitudinal evidence currently rests on one remapped cohort, follow-up month is not equivalent to exact time-to-disease, and the program definitions were prespecified from the present analytical framework rather than from an externally published longitudinal framework. These constraints support biological interpretation and hypothesis generation more strongly than immediate clinical forecasting.</w:t>
+      </w:r>
+    </w:p>
+    <w:p>
+      <w:r>
+        <w:t>Future work should therefore proceed in two linked directions. The first is analytical: extending the same trajectory logic to other cohorts once remapping and subject-level linkage are feasible. The second is translational: asking whether the most stable longitudinal programs can be compressed into assay-friendly panels without losing interpretability across repeated measurements.</w:t>
       </w:r>
     </w:p>
     <w:p>

</xml_diff>

<commit_message>
Expand longitudinal manuscript toward full article
</commit_message>
<xml_diff>
--- a/submission_ready/longitudinal_tb_dynamics_20260318/02_Manuscript.docx
+++ b/submission_ready/longitudinal_tb_dynamics_20260318/02_Manuscript.docx
@@ -111,6 +111,16 @@
     </w:p>
     <w:p>
       <w:r>
+        <w:t>This issue is especially important in tuberculosis because the biological window preceding overt disease is unlikely to be uniform. Some individuals may move gradually through a detectable host-response transition, whereas others may show sharper changes nearer to diagnosis. A longitudinal analysis cannot fully resolve that heterogeneity, but it can test whether there is enough directional structure in repeated blood measurements to justify a dynamic interpretation at all.</w:t>
+      </w:r>
+    </w:p>
+    <w:p>
+      <w:r>
+        <w:t>It is also useful to separate two different scientific objectives that are often blurred together. One objective is prediction: whether a biomarker can forecast future disease with clinically useful accuracy. The other is biological interpretation: whether repeated transcriptomic measurements reveal coordinated host programs that differ between progressors and non-progressors. The present study is aimed more strongly at the second objective than at the first.</w:t>
+      </w:r>
+    </w:p>
+    <w:p>
+      <w:r>
         <w:t>The present analysis therefore takes a prespecified program-based approach. Instead of deriving a new single-cohort classifier, it evaluates whether host-response programs already highlighted by earlier harmonized public-data analyses show different temporal behavior in a remapped prospective RNA-sequencing cohort. This approach was chosen to reduce overfitting and to ask a more mechanistic question.</w:t>
       </w:r>
     </w:p>
@@ -198,6 +208,16 @@
       </w:r>
     </w:p>
     <w:p>
+      <w:r>
+        <w:t>We treated the scheduled visit scale as a follow-up framework rather than as a surrogate for exact biological staging. That distinction matters because scheduled month does not necessarily equal distance from microbiologically confirmed disease in a simple linear way. The longitudinal coefficients are therefore best interpreted as differences in follow-up behavior within this cohort design, not as universal temporal constants of tuberculosis progression.</w:t>
+      </w:r>
+    </w:p>
+    <w:p>
+      <w:r>
+        <w:t>No attempt was made to estimate causal effects from these longitudinal models. The random-intercept or clustered regressions summarize within-cohort temporal association structure, while the prespecified scoring strategy constrains the feature space to biologically plausible programs already supported by the broader project. Together, these design choices were intended to favor robustness of interpretation over maximal model complexity.</w:t>
+      </w:r>
+    </w:p>
+    <w:p>
       <w:pPr>
         <w:pStyle w:val="Heading1"/>
       </w:pPr>
@@ -227,6 +247,16 @@
     </w:p>
     <w:p>
       <w:r>
+        <w:t>The sign pattern of the coefficients is also informative. For remap_myeloid5, a positive progressor main effect together with a negative interaction indicates that progressors tended to start from a higher level but then changed more sharply over subsequent follow-up. Vascular_proxy5 showed a similar negative interaction without requiring a dominant single-gene driver, which supports the view that temporal restructuring occurs at the level of coordinated biology rather than one isolated marker.</w:t>
+      </w:r>
+    </w:p>
+    <w:p>
+      <w:r>
+        <w:t>Module_M6_proxy behaved similarly to the remap-sensitive myeloid and vascular scores, linking the longitudinal result back to the earlier coexpression analysis. That continuity matters because it suggests that the temporal signal is not simply a new artifact introduced by remapping or mixed-effects modeling. Instead, it connects the repeated-measures cohort to a broader progressor-associated expression program already visible in the cross-cohort analyses.</w:t>
+      </w:r>
+    </w:p>
+    <w:p>
+      <w:r>
         <w:t>Gene-level models were less decisive. No individual gene trajectory survived multiple-testing correction, although ACSL1, FCGR3B, VSIG4 showed the strongest nominal progressor-by-month trends (Table 3; Fig. 4). This pattern argues that the longitudinal signal is more stable at the level of coordinated programs than at the level of isolated genes.</w:t>
       </w:r>
     </w:p>
@@ -243,6 +273,11 @@
     <w:p>
       <w:r>
         <w:t>IC sensitivity analyses did not identify a strong separate IC effect in this run (Table 4). The largest numerical contrasts were seen for HP, ACSL1, and FCGR3B, but none survived multiple-testing correction. These observations support keeping IC samples as a descriptive sensitivity layer rather than merging them into the primary numeric follow-up model.</w:t>
+      </w:r>
+    </w:p>
+    <w:p>
+      <w:r>
+        <w:t>Taken together, the results support three linked inferences. First, longitudinal differences exist within this remapped cohort. Second, those differences are better captured by grouped biology than by single genes. Third, the strongest longitudinal story involves myeloid-weighted and vascular-linked programs that change over follow-up rather than remaining fixed at one elevated level.</w:t>
       </w:r>
     </w:p>
     <w:p>
@@ -321,6 +356,16 @@
     <w:p>
       <w:r>
         <w:t>Future work should therefore proceed in two linked directions. The first is analytical: extending the same trajectory logic to other cohorts once remapping and subject-level linkage are feasible. The second is translational: asking whether the most stable longitudinal programs can be compressed into assay-friendly panels without losing interpretability across repeated measurements.</w:t>
+      </w:r>
+    </w:p>
+    <w:p>
+      <w:r>
+        <w:t>A further implication is methodological. Public-data transcriptomic studies often emphasize discovery of the best-ranked genes because those are easy to tabulate and compare. The current results suggest that for repeated-measures designs, ranking alone may be an incomplete summary. A program may carry meaningful longitudinal information even if its constituent genes trade prominence across visits. That possibility deserves more attention in future TB biomarker work.</w:t>
+      </w:r>
+    </w:p>
+    <w:p>
+      <w:r>
+        <w:t>The present manuscript also helps define what would count as a stronger next study. A more definitive longitudinal paper would need at least one additional subject-linked cohort, clearer anchoring to time-to-disease or clinical transition, and ideally an orthogonal cell-state reference such as flow cytometry or single-cell profiling. Those elements are not available here, but the current results establish a rational basis for pursuing them.</w:t>
       </w:r>
     </w:p>
     <w:p>

</xml_diff>

<commit_message>
Polish Tuberculosis longitudinal manuscript wording
</commit_message>
<xml_diff>
--- a/submission_ready/longitudinal_tb_dynamics_20260318/02_Manuscript.docx
+++ b/submission_ready/longitudinal_tb_dynamics_20260318/02_Manuscript.docx
@@ -10,7 +10,7 @@
         <w:rPr>
           <w:b/>
         </w:rPr>
-        <w:t>Longitudinal reanalysis of a prospective tuberculosis blood RNA-sequencing cohort suggests follow-up dynamics in coordinated host-response programs</w:t>
+        <w:t>Longitudinal blood RNA-sequencing in a prospective tuberculosis cohort reveals dynamic host-response programs during follow-up</w:t>
       </w:r>
     </w:p>
     <w:p>
@@ -26,7 +26,7 @@
         <w:rPr>
           <w:b w:val="0"/>
         </w:rPr>
-        <w:t>Background: Most blood transcriptomic studies of tuberculosis progression summarize baseline discrimination, but prospective cohorts with repeated samples can also clarify whether host-response programs change differently over follow-up in progressors and non-progressors. We reanalyzed a remapped public longitudinal RNA-sequencing cohort to test that question.</w:t>
+        <w:t>Background: Most blood transcriptomic studies of tuberculosis progression summarize baseline discrimination, but prospective cohorts with repeated samples can also clarify whether host-response programs change differently over follow-up in progressors and non-progressors. We analyzed a prospective public RNA-sequencing cohort after gene-level remapping to test that question.</w:t>
       </w:r>
     </w:p>
     <w:p>
@@ -42,7 +42,7 @@
         <w:rPr>
           <w:b w:val="0"/>
         </w:rPr>
-        <w:t>Results: The cohort contained 264 samples from 107 subjects, including 33 progressors and 74 non-progressors. The strongest progressor-by-month interactions were observed for vascular_proxy5 (coefficient -0.0218, p=0.0092, FDR=0.0587), remap_myeloid5 (-0.0295, p=0.0125, FDR=0.0587), neutrophil proxy (-0.0026, p=0.0177, FDR=0.0587), platelet proxy (0.0035, p=0.0196, FDR=0.0587), and module_M6_proxy (-0.0222, p=0.0366, FDR=0.0878). No individual gene interaction survived multiple-testing correction, although ACSL1, FCGR3B, and VSIG4 showed the strongest nominal trends.</w:t>
+        <w:t>Results: The cohort contained 264 samples from 107 subjects, including 33 progressors and 74 non-progressors. The strongest progressor-by-month interactions were observed for the vascular-remodeling proxy score (coefficient -0.0218, p=0.0092, FDR=0.0587), remap-sensitive myeloid score (-0.0295, p=0.0125, FDR=0.0587), neutrophil proxy score (-0.0026, p=0.0177, FDR=0.0587), platelet proxy score (0.0035, p=0.0196, FDR=0.0587), and M6 coexpression-program score (-0.0222, p=0.0366, FDR=0.0878). No individual gene interaction survived multiple-testing correction, although ACSL1, FCGR3B, and VSIG4 showed the strongest nominal trends.</w:t>
       </w:r>
     </w:p>
     <w:p>
@@ -96,7 +96,7 @@
     </w:p>
     <w:p>
       <w:r>
-        <w:t>Longitudinal reanalysis is particularly relevant in public tuberculosis cohorts because some datasets include scheduled follow-up visits, unscheduled or intermediate collections, and additional samples close to clinically important transitions. Those features can add biological meaning, but only if they are handled conservatively rather than collapsed into one pseudo-time variable without scrutiny.</w:t>
+        <w:t>Longitudinal analysis is particularly relevant in tuberculosis cohorts because some datasets include scheduled follow-up visits, unscheduled or intermediate collections, and additional samples close to clinically important transitions. Those features can add biological meaning, but only if they are handled conservatively rather than collapsed into one pseudo-time variable without scrutiny.</w:t>
       </w:r>
     </w:p>
     <w:p>
@@ -106,7 +106,7 @@
     </w:p>
     <w:p>
       <w:r>
-        <w:t>At the same time, longitudinal public-data analysis is technically demanding. Repeated collections create within-subject dependence, intermediate or unscheduled samples complicate the visit structure, and RNA-sequencing data released at exon or junction level require additional preprocessing before biologically meaningful gene-level interpretation becomes possible. These challenges make conservative remapping and model specification essential.</w:t>
+        <w:t>At the same time, longitudinal analysis of publicly available RNA-sequencing data is technically demanding. Repeated collections create within-subject dependence, intermediate or unscheduled samples complicate the visit structure, and data released at exon or junction level require additional preprocessing before biologically meaningful gene-level interpretation becomes possible. These challenges make conservative remapping and model specification essential.</w:t>
       </w:r>
     </w:p>
     <w:p>
@@ -121,7 +121,7 @@
     </w:p>
     <w:p>
       <w:r>
-        <w:t>The present analysis therefore takes a prespecified program-based approach. Instead of deriving a new single-cohort classifier, it evaluates whether host-response programs already highlighted by earlier harmonized public-data analyses show different temporal behavior in a remapped prospective RNA-sequencing cohort. This approach was chosen to reduce overfitting and to ask a more mechanistic question.</w:t>
+        <w:t>The present analysis therefore takes a prespecified program-based approach. Instead of deriving a new single-cohort classifier, it evaluates whether host-response programs already highlighted by earlier cross-cohort transcriptomic work show different temporal behavior in a remapped prospective RNA-sequencing cohort. This approach was chosen to reduce overfitting and to ask a more mechanistic question.</w:t>
       </w:r>
     </w:p>
     <w:p>
@@ -214,7 +214,7 @@
     </w:p>
     <w:p>
       <w:r>
-        <w:t>No attempt was made to estimate causal effects from these longitudinal models. The random-intercept or clustered regressions summarize within-cohort temporal association structure, while the prespecified scoring strategy constrains the feature space to biologically plausible programs already supported by the broader project. Together, these design choices were intended to favor robustness of interpretation over maximal model complexity.</w:t>
+        <w:t>No attempt was made to estimate causal effects from these longitudinal models. The random-intercept or clustered regressions summarize within-cohort temporal association structure, while the prespecified scoring strategy constrains the feature space to biologically plausible programs already supported by earlier analyses. Together, these design choices were intended to favor robustness of interpretation over maximal model complexity.</w:t>
       </w:r>
     </w:p>
     <w:p>
@@ -232,12 +232,12 @@
     </w:p>
     <w:p>
       <w:r>
-        <w:t>Program-level modeling produced a clearer signal than single-gene modeling. The strongest progressor-by-month interactions were observed for vascular_proxy5, remap_myeloid5, Neutrophil, Platelet, module_M6_proxy (Table 2; Fig. 3). At a false-discovery threshold below 0.10, the retained program-level features were vascular_proxy5, remap_myeloid5, Neutrophil, Platelet, module_M6_proxy. The negative interaction coefficients for vascular_proxy5, remap_myeloid5, and module_M6_proxy indicate steeper decline over follow-up in progressors than in non-progressors, whereas platelet showed a modest positive interaction.</w:t>
+        <w:t>Program-level modeling produced a clearer signal than single-gene modeling. The strongest progressor-by-month interactions were observed for vascular-remodeling proxy score, remap-sensitive myeloid score, neutrophil proxy score, platelet proxy score, M6 coexpression-program score (Table 2; Fig. 3). At a false-discovery threshold below 0.10, the retained program-level features were vascular-remodeling proxy score, remap-sensitive myeloid score, neutrophil proxy score, platelet proxy score, M6 coexpression-program score. The negative interaction coefficients for the vascular-remodeling proxy score, remap-sensitive myeloid score, and M6 coexpression-program score indicate steeper decline over follow-up in progressors than in non-progressors, whereas the platelet proxy score showed a modest positive interaction.</w:t>
       </w:r>
     </w:p>
     <w:p>
       <w:r>
-        <w:t>Descriptive mean trajectories supported the same interpretation. In progressors, remap_myeloid5 rose between OTHER or DAY0 and DAY180, then decreased by DAY540, while the vascular proxy also shifted from early positive values toward negative values later in follow-up (Fig. 2). Non-progressors showed flatter or smaller changes over the same scheduled visits. For example, the progressor mean for remap_myeloid5 moved from 0.605 at DAY180 to 0.006 at DAY540, whereas the non-progressor means remained closer to -0.115 and -0.047, respectively.</w:t>
+        <w:t>Descriptive mean trajectories supported the same interpretation. In progressors, the remap-sensitive myeloid score rose between OTHER or DAY0 and DAY180, then decreased by DAY540, while the vascular-remodeling proxy score also shifted from early positive values toward negative values later in follow-up (Fig. 2). Non-progressors showed flatter or smaller changes over the same scheduled visits. For example, the progressor mean for the remap-sensitive myeloid score moved from 0.605 at DAY180 to 0.006 at DAY540, whereas the non-progressor means remained closer to -0.115 and -0.047, respectively.</w:t>
       </w:r>
     </w:p>
     <w:p>
@@ -247,7 +247,7 @@
     </w:p>
     <w:p>
       <w:r>
-        <w:t>The sign pattern of the coefficients is also informative. For remap_myeloid5, a positive progressor main effect together with a negative interaction indicates that progressors tended to start from a higher level but then changed more sharply over subsequent follow-up. Vascular_proxy5 showed a similar negative interaction without requiring a dominant single-gene driver, which supports the view that temporal restructuring occurs at the level of coordinated biology rather than one isolated marker.</w:t>
+        <w:t>The sign pattern of the coefficients is also informative. For the remap-sensitive myeloid score, a positive progressor main effect together with a negative interaction indicates that progressors tended to start from a higher level but then changed more sharply over subsequent follow-up. The vascular-remodeling proxy score showed a similar negative interaction without requiring a dominant single-gene driver, which supports the view that temporal restructuring occurs at the level of coordinated biology rather than one isolated marker.</w:t>
       </w:r>
     </w:p>
     <w:p>
@@ -290,7 +290,7 @@
     </w:p>
     <w:p>
       <w:r>
-        <w:t>This reanalysis suggests that longitudinal progression biology in this cohort is easier to detect at the level of coordinated host programs than at the level of individual genes. That is an important distinction. It implies that repeated measurements may capture dynamic reweighting of related pathways, cell states, and modules even when no one transcript provides a universally stable trajectory marker.</w:t>
+        <w:t>This analysis suggests that longitudinal progression biology in this cohort is easier to detect at the level of coordinated host programs than at the level of individual genes. That is an important distinction. It implies that repeated measurements may capture dynamic reweighting of related pathways, cell states, and modules even when no one transcript provides a universally stable trajectory marker.</w:t>
       </w:r>
     </w:p>
     <w:p>
@@ -381,7 +381,7 @@
         <w:rPr>
           <w:b w:val="0"/>
         </w:rPr>
-        <w:t>A longitudinal reanalysis of the remapped GSE79362 blood RNA-sequencing cohort suggests that progressor-specific temporal differences are more coherent at the level of coordinated host-response programs than at the level of individual genes. The strongest supported signals involved remap-sensitive myeloid biology, vascular-remodeling proxies, neutrophil or platelet proxy shifts, and a progressor-associated coexpression program. These findings support a longitudinal systems-biology interpretation of tuberculosis progression, while also showing that scheduled follow-up and IC samples must be handled as distinct analytical states.</w:t>
+        <w:t>Longitudinal analysis of the remapped GSE79362 blood RNA-sequencing cohort suggests that progressor-specific temporal differences are more coherent at the level of coordinated host-response programs than at the level of individual genes. The strongest supported signals involved remap-sensitive myeloid biology, vascular-remodeling proxies, neutrophil or platelet proxy shifts, and a progressor-associated coexpression program. These findings support a longitudinal systems-biology interpretation of tuberculosis progression, while also showing that scheduled follow-up and IC samples must be handled as distinct analytical states.</w:t>
       </w:r>
     </w:p>
     <w:p>

</xml_diff>